<commit_message>
hill template changes - acc to feedback: education, key_qualifications, project name extraction
</commit_message>
<xml_diff>
--- a/templates/hill_template.docx
+++ b/templates/hill_template.docx
@@ -296,7 +296,6 @@
           <w:p>
             <w:pPr>
               <w:pStyle w:val="SideBarText"/>
-              <w:spacing w:line="240" w:lineRule="auto"/>
               <w:jc w:val="both"/>
               <w:rPr>
                 <w:color w:val="000000" w:themeColor="text1"/>
@@ -312,75 +311,16 @@
           <w:p>
             <w:pPr>
               <w:pStyle w:val="SideBarText"/>
-              <w:spacing w:line="240" w:lineRule="auto"/>
               <w:jc w:val="both"/>
               <w:rPr>
-                <w:b/>
-                <w:bCs/>
                 <w:color w:val="000000" w:themeColor="text1"/>
               </w:rPr>
             </w:pPr>
             <w:r>
               <w:rPr>
-                <w:b/>
-                <w:bCs/>
-                <w:color w:val="000000" w:themeColor="text1"/>
-              </w:rPr>
-              <w:t>{{edu.degree}}</w:t>
-            </w:r>
-          </w:p>
-          <w:p>
-            <w:pPr>
-              <w:pStyle w:val="SideBarText"/>
-              <w:spacing w:line="240" w:lineRule="auto"/>
-              <w:jc w:val="both"/>
-              <w:rPr>
-                <w:b/>
-                <w:bCs/>
-                <w:color w:val="000000" w:themeColor="text1"/>
-              </w:rPr>
-            </w:pPr>
-            <w:r>
-              <w:rPr>
-                <w:b/>
-                <w:bCs/>
-                <w:color w:val="000000" w:themeColor="text1"/>
-              </w:rPr>
-              <w:t>{{edu.institution}}</w:t>
-            </w:r>
-          </w:p>
-          <w:p>
-            <w:pPr>
-              <w:pStyle w:val="SideBarText"/>
-              <w:spacing w:line="240" w:lineRule="auto"/>
-              <w:jc w:val="both"/>
-              <w:rPr>
-                <w:color w:val="000000" w:themeColor="text1"/>
-              </w:rPr>
-            </w:pPr>
-            <w:r>
-              <w:rPr>
-                <w:color w:val="000000" w:themeColor="text1"/>
-              </w:rPr>
-              <w:t>{{edu.year}}</w:t>
-            </w:r>
-          </w:p>
-          <w:p>
-            <w:pPr>
-              <w:pStyle w:val="SideBarText"/>
-              <w:spacing w:line="240" w:lineRule="auto"/>
-              <w:jc w:val="both"/>
-              <w:rPr>
-                <w:b/>
-                <w:bCs/>
-                <w:color w:val="000000" w:themeColor="text1"/>
-              </w:rPr>
-            </w:pPr>
-            <w:r>
-              <w:rPr>
-                <w:color w:val="000000" w:themeColor="text1"/>
-              </w:rPr>
-              <w:t>{{edu.location}}</w:t>
+                <w:color w:val="000000" w:themeColor="text1"/>
+              </w:rPr>
+              <w:t>{{ edu }}</w:t>
             </w:r>
           </w:p>
           <w:p>
@@ -603,6 +543,36 @@
           <w:p>
             <w:pPr>
               <w:pStyle w:val="SideBarText"/>
+              <w:jc w:val="both"/>
+              <w:rPr>
+                <w:color w:val="000000" w:themeColor="text1"/>
+              </w:rPr>
+            </w:pPr>
+            <w:r>
+              <w:rPr>
+                <w:color w:val="000000" w:themeColor="text1"/>
+              </w:rPr>
+              <w:t>{% for q in key_qualifications %}</w:t>
+            </w:r>
+          </w:p>
+          <w:p>
+            <w:pPr>
+              <w:pStyle w:val="SideBarText"/>
+              <w:jc w:val="both"/>
+              <w:rPr>
+                <w:color w:val="000000" w:themeColor="text1"/>
+              </w:rPr>
+            </w:pPr>
+            <w:r>
+              <w:rPr>
+                <w:color w:val="000000" w:themeColor="text1"/>
+              </w:rPr>
+              <w:t>{{ q }}</w:t>
+            </w:r>
+          </w:p>
+          <w:p>
+            <w:pPr>
+              <w:pStyle w:val="SideBarText"/>
               <w:spacing w:line="240" w:lineRule="auto"/>
               <w:jc w:val="both"/>
               <w:rPr>
@@ -613,7 +583,7 @@
               <w:rPr>
                 <w:color w:val="000000" w:themeColor="text1"/>
               </w:rPr>
-              <w:t>{{key_qualifications}}</w:t>
+              <w:t>{% endfor %}</w:t>
             </w:r>
           </w:p>
         </w:tc>
@@ -775,7 +745,29 @@
           <w:sz w:val="22"/>
           <w:szCs w:val="22"/>
         </w:rPr>
-        <w:t>{{project.duration}} | {{project.company_name}}</w:t>
+        <w:t>{{project.duration}} | {{</w:t>
+      </w:r>
+      <w:r>
+        <w:rPr>
+          <w:rFonts w:ascii="Calibri" w:hAnsi="Calibri"/>
+          <w:b/>
+          <w:bCs/>
+          <w:color w:val="000000" w:themeColor="text1"/>
+          <w:sz w:val="22"/>
+          <w:szCs w:val="22"/>
+        </w:rPr>
+        <w:t>project.project_name</w:t>
+      </w:r>
+      <w:r>
+        <w:rPr>
+          <w:rFonts w:ascii="Calibri" w:hAnsi="Calibri"/>
+          <w:b/>
+          <w:bCs/>
+          <w:color w:val="000000" w:themeColor="text1"/>
+          <w:sz w:val="22"/>
+          <w:szCs w:val="22"/>
+        </w:rPr>
+        <w:t>}}</w:t>
       </w:r>
     </w:p>
     <w:p>

</xml_diff>